<commit_message>
md2docx-extract-style: 스킬 이름 교정 + reference.docx 를 base_templates/ 아래로 이동
- 디렉터리 rename: extract-docx-styles → md2docx-extract-style (오타 md2dox→md2docx 포함)
- extract.py: normalize_source() 가 <out>/base_templates/reference.docx 에 저장
  (reference.docx 의 역할 — 'pandoc 용 베이스 템플릿' — 을 경로로 명시)
- validate_skill.py C1: 새 경로 기준으로 해시 비교
- SKILL.md: 산출물 구조도 + pandoc 예시 + report.tsv 샘플 모두 새 경로로
- 45/45 PASS 유지 (C1~C9 전부)

Co-Authored-By: Claude Opus 4.7 (1M context) <noreply@anthropic.com>
</commit_message>
<xml_diff>
--- a/references/templates/reference_reg.docx
+++ b/references/templates/reference_reg.docx
@@ -5,22 +5,18 @@
     <w:p>
       <w:pPr>
         <w:pStyle w:val="1"/>
-        <w:rPr>
-          <w:b/>
-          <w:bCs/>
-          <w:sz w:val="28"/>
-          <w:szCs w:val="32"/>
-        </w:rPr>
       </w:pPr>
       <w:r>
         <w:rPr>
           <w:rFonts w:hint="eastAsia"/>
-          <w:b/>
-          <w:bCs/>
-          <w:sz w:val="28"/>
-          <w:szCs w:val="32"/>
         </w:rPr>
-        <w:t>선급등록 및 검사</w:t>
+        <w:t>선급등록</w:t>
+      </w:r>
+      <w:r>
+        <w:rPr>
+          <w:rFonts w:hint="eastAsia"/>
+        </w:rPr>
+        <w:t xml:space="preserve"> 및 검사</w:t>
       </w:r>
     </w:p>
     <w:p>
@@ -78,7 +74,14 @@
         <w:t>규칙이라 함은 우리</w:t>
       </w:r>
     </w:p>
-    <w:p/>
+    <w:p>
+      <w:pPr>
+        <w:pStyle w:val="7"/>
+      </w:pPr>
+      <w:r>
+        <w:t>Last</w:t>
+      </w:r>
+    </w:p>
     <w:tbl>
       <w:tblPr>
         <w:tblStyle w:val="aa"/>
@@ -678,7 +681,7 @@
   <w:abstractNum w:abstractNumId="0" w15:restartNumberingAfterBreak="0">
     <w:nsid w:val="076A2DCB"/>
     <w:multiLevelType w:val="multilevel"/>
-    <w:tmpl w:val="F412D72E"/>
+    <w:tmpl w:val="63B80750"/>
     <w:lvl w:ilvl="0">
       <w:start w:val="1"/>
       <w:numFmt w:val="decimal"/>
@@ -764,11 +767,12 @@
     </w:lvl>
     <w:lvl w:ilvl="6">
       <w:start w:val="1"/>
-      <w:numFmt w:val="decimal"/>
-      <w:lvlText w:val="%1.%2.%3.%4.%5.%6.%7"/>
-      <w:lvlJc w:val="left"/>
-      <w:pPr>
-        <w:ind w:left="2975" w:hanging="425"/>
+      <w:numFmt w:val="decimalEnclosedCircle"/>
+      <w:pStyle w:val="7"/>
+      <w:lvlText w:val="%7"/>
+      <w:lvlJc w:val="left"/>
+      <w:pPr>
+        <w:ind w:left="397" w:hanging="397"/>
       </w:pPr>
       <w:rPr>
         <w:rFonts w:hint="eastAsia"/>
@@ -800,6 +804,328 @@
     </w:lvl>
   </w:abstractNum>
   <w:abstractNum w:abstractNumId="1" w15:restartNumberingAfterBreak="0">
+    <w:nsid w:val="44D42E2D"/>
+    <w:multiLevelType w:val="multilevel"/>
+    <w:tmpl w:val="0409001D"/>
+    <w:lvl w:ilvl="0">
+      <w:start w:val="1"/>
+      <w:numFmt w:val="decimal"/>
+      <w:lvlText w:val="%1"/>
+      <w:lvlJc w:val="left"/>
+      <w:pPr>
+        <w:ind w:left="425" w:hanging="425"/>
+      </w:pPr>
+    </w:lvl>
+    <w:lvl w:ilvl="1">
+      <w:start w:val="1"/>
+      <w:numFmt w:val="decimal"/>
+      <w:lvlText w:val="%1.%2"/>
+      <w:lvlJc w:val="left"/>
+      <w:pPr>
+        <w:ind w:left="992" w:hanging="567"/>
+      </w:pPr>
+    </w:lvl>
+    <w:lvl w:ilvl="2">
+      <w:start w:val="1"/>
+      <w:numFmt w:val="decimal"/>
+      <w:lvlText w:val="%1.%2.%3"/>
+      <w:lvlJc w:val="left"/>
+      <w:pPr>
+        <w:ind w:left="1418" w:hanging="567"/>
+      </w:pPr>
+    </w:lvl>
+    <w:lvl w:ilvl="3">
+      <w:start w:val="1"/>
+      <w:numFmt w:val="decimal"/>
+      <w:lvlText w:val="%1.%2.%3.%4"/>
+      <w:lvlJc w:val="left"/>
+      <w:pPr>
+        <w:ind w:left="1984" w:hanging="708"/>
+      </w:pPr>
+    </w:lvl>
+    <w:lvl w:ilvl="4">
+      <w:start w:val="1"/>
+      <w:numFmt w:val="decimal"/>
+      <w:lvlText w:val="%1.%2.%3.%4.%5"/>
+      <w:lvlJc w:val="left"/>
+      <w:pPr>
+        <w:ind w:left="2551" w:hanging="850"/>
+      </w:pPr>
+    </w:lvl>
+    <w:lvl w:ilvl="5">
+      <w:start w:val="1"/>
+      <w:numFmt w:val="decimal"/>
+      <w:lvlText w:val="%1.%2.%3.%4.%5.%6"/>
+      <w:lvlJc w:val="left"/>
+      <w:pPr>
+        <w:ind w:left="3260" w:hanging="1134"/>
+      </w:pPr>
+    </w:lvl>
+    <w:lvl w:ilvl="6">
+      <w:start w:val="1"/>
+      <w:numFmt w:val="decimal"/>
+      <w:lvlText w:val="%1.%2.%3.%4.%5.%6.%7"/>
+      <w:lvlJc w:val="left"/>
+      <w:pPr>
+        <w:ind w:left="3827" w:hanging="1276"/>
+      </w:pPr>
+    </w:lvl>
+    <w:lvl w:ilvl="7">
+      <w:start w:val="1"/>
+      <w:numFmt w:val="decimal"/>
+      <w:lvlText w:val="%1.%2.%3.%4.%5.%6.%7.%8"/>
+      <w:lvlJc w:val="left"/>
+      <w:pPr>
+        <w:ind w:left="4394" w:hanging="1418"/>
+      </w:pPr>
+    </w:lvl>
+    <w:lvl w:ilvl="8">
+      <w:start w:val="1"/>
+      <w:numFmt w:val="decimal"/>
+      <w:lvlText w:val="%1.%2.%3.%4.%5.%6.%7.%8.%9"/>
+      <w:lvlJc w:val="left"/>
+      <w:pPr>
+        <w:ind w:left="5102" w:hanging="1700"/>
+      </w:pPr>
+    </w:lvl>
+  </w:abstractNum>
+  <w:abstractNum w:abstractNumId="2" w15:restartNumberingAfterBreak="0">
+    <w:nsid w:val="4E2C4468"/>
+    <w:multiLevelType w:val="multilevel"/>
+    <w:tmpl w:val="CA12A530"/>
+    <w:lvl w:ilvl="0">
+      <w:start w:val="1"/>
+      <w:numFmt w:val="decimal"/>
+      <w:lvlText w:val="제 %1 편"/>
+      <w:lvlJc w:val="left"/>
+      <w:pPr>
+        <w:ind w:left="425" w:hanging="425"/>
+      </w:pPr>
+      <w:rPr>
+        <w:rFonts w:hint="eastAsia"/>
+      </w:rPr>
+    </w:lvl>
+    <w:lvl w:ilvl="1">
+      <w:start w:val="1"/>
+      <w:numFmt w:val="decimal"/>
+      <w:lvlText w:val="제 %2 장"/>
+      <w:lvlJc w:val="left"/>
+      <w:pPr>
+        <w:ind w:left="1134" w:hanging="1134"/>
+      </w:pPr>
+      <w:rPr>
+        <w:rFonts w:hint="eastAsia"/>
+        <w:b w:val="0"/>
+        <w:bCs/>
+        <w:i w:val="0"/>
+        <w:sz w:val="24"/>
+        <w:szCs w:val="24"/>
+      </w:rPr>
+    </w:lvl>
+    <w:lvl w:ilvl="2">
+      <w:start w:val="1"/>
+      <w:numFmt w:val="decimal"/>
+      <w:lvlText w:val="제 %3 절"/>
+      <w:lvlJc w:val="left"/>
+      <w:pPr>
+        <w:ind w:left="1134" w:hanging="1134"/>
+      </w:pPr>
+      <w:rPr>
+        <w:rFonts w:hint="eastAsia"/>
+      </w:rPr>
+    </w:lvl>
+    <w:lvl w:ilvl="3">
+      <w:start w:val="1"/>
+      <w:numFmt w:val="decimalZero"/>
+      <w:lvlText w:val="%3%4."/>
+      <w:lvlJc w:val="left"/>
+      <w:pPr>
+        <w:ind w:left="425" w:hanging="425"/>
+      </w:pPr>
+      <w:rPr>
+        <w:rFonts w:hint="eastAsia"/>
+      </w:rPr>
+    </w:lvl>
+    <w:lvl w:ilvl="4">
+      <w:start w:val="1"/>
+      <w:numFmt w:val="decimal"/>
+      <w:lvlText w:val="%5."/>
+      <w:lvlJc w:val="left"/>
+      <w:pPr>
+        <w:ind w:left="425" w:hanging="255"/>
+      </w:pPr>
+      <w:rPr>
+        <w:rFonts w:hint="eastAsia"/>
+      </w:rPr>
+    </w:lvl>
+    <w:lvl w:ilvl="5">
+      <w:start w:val="1"/>
+      <w:numFmt w:val="decimal"/>
+      <w:lvlText w:val="(%6)"/>
+      <w:lvlJc w:val="left"/>
+      <w:pPr>
+        <w:ind w:left="425" w:hanging="425"/>
+      </w:pPr>
+      <w:rPr>
+        <w:rFonts w:hint="eastAsia"/>
+      </w:rPr>
+    </w:lvl>
+    <w:lvl w:ilvl="6">
+      <w:start w:val="1"/>
+      <w:numFmt w:val="decimalEnclosedCircle"/>
+      <w:lvlText w:val="%7"/>
+      <w:lvlJc w:val="left"/>
+      <w:pPr>
+        <w:ind w:left="397" w:hanging="170"/>
+      </w:pPr>
+      <w:rPr>
+        <w:rFonts w:hint="eastAsia"/>
+      </w:rPr>
+    </w:lvl>
+    <w:lvl w:ilvl="7">
+      <w:start w:val="1"/>
+      <w:numFmt w:val="decimal"/>
+      <w:lvlText w:val="%1.%2.%3.%4.%5.%6.%7.%8"/>
+      <w:lvlJc w:val="left"/>
+      <w:pPr>
+        <w:ind w:left="3400" w:hanging="425"/>
+      </w:pPr>
+      <w:rPr>
+        <w:rFonts w:hint="eastAsia"/>
+      </w:rPr>
+    </w:lvl>
+    <w:lvl w:ilvl="8">
+      <w:start w:val="1"/>
+      <w:numFmt w:val="decimal"/>
+      <w:lvlText w:val="%1.%2.%3.%4.%5.%6.%7.%8.%9"/>
+      <w:lvlJc w:val="left"/>
+      <w:pPr>
+        <w:ind w:left="3825" w:hanging="425"/>
+      </w:pPr>
+      <w:rPr>
+        <w:rFonts w:hint="eastAsia"/>
+      </w:rPr>
+    </w:lvl>
+  </w:abstractNum>
+  <w:abstractNum w:abstractNumId="3" w15:restartNumberingAfterBreak="0">
+    <w:nsid w:val="608A46D9"/>
+    <w:multiLevelType w:val="multilevel"/>
+    <w:tmpl w:val="63B80750"/>
+    <w:lvl w:ilvl="0">
+      <w:start w:val="1"/>
+      <w:numFmt w:val="decimal"/>
+      <w:lvlText w:val="제 %1 편"/>
+      <w:lvlJc w:val="left"/>
+      <w:pPr>
+        <w:ind w:left="425" w:hanging="425"/>
+      </w:pPr>
+      <w:rPr>
+        <w:rFonts w:hint="eastAsia"/>
+      </w:rPr>
+    </w:lvl>
+    <w:lvl w:ilvl="1">
+      <w:start w:val="1"/>
+      <w:numFmt w:val="decimal"/>
+      <w:lvlText w:val="제 %2 장"/>
+      <w:lvlJc w:val="left"/>
+      <w:pPr>
+        <w:ind w:left="1134" w:hanging="1134"/>
+      </w:pPr>
+      <w:rPr>
+        <w:rFonts w:hint="eastAsia"/>
+        <w:b w:val="0"/>
+        <w:bCs/>
+        <w:i w:val="0"/>
+        <w:sz w:val="24"/>
+        <w:szCs w:val="24"/>
+      </w:rPr>
+    </w:lvl>
+    <w:lvl w:ilvl="2">
+      <w:start w:val="1"/>
+      <w:numFmt w:val="decimal"/>
+      <w:lvlText w:val="제 %3 절"/>
+      <w:lvlJc w:val="left"/>
+      <w:pPr>
+        <w:ind w:left="1134" w:hanging="1134"/>
+      </w:pPr>
+      <w:rPr>
+        <w:rFonts w:hint="eastAsia"/>
+      </w:rPr>
+    </w:lvl>
+    <w:lvl w:ilvl="3">
+      <w:start w:val="1"/>
+      <w:numFmt w:val="decimalZero"/>
+      <w:lvlText w:val="%3%4."/>
+      <w:lvlJc w:val="left"/>
+      <w:pPr>
+        <w:ind w:left="425" w:hanging="425"/>
+      </w:pPr>
+      <w:rPr>
+        <w:rFonts w:hint="eastAsia"/>
+      </w:rPr>
+    </w:lvl>
+    <w:lvl w:ilvl="4">
+      <w:start w:val="1"/>
+      <w:numFmt w:val="decimal"/>
+      <w:lvlText w:val="%5."/>
+      <w:lvlJc w:val="left"/>
+      <w:pPr>
+        <w:ind w:left="425" w:hanging="255"/>
+      </w:pPr>
+      <w:rPr>
+        <w:rFonts w:hint="eastAsia"/>
+      </w:rPr>
+    </w:lvl>
+    <w:lvl w:ilvl="5">
+      <w:start w:val="1"/>
+      <w:numFmt w:val="decimal"/>
+      <w:lvlText w:val="(%6)"/>
+      <w:lvlJc w:val="left"/>
+      <w:pPr>
+        <w:ind w:left="425" w:hanging="425"/>
+      </w:pPr>
+      <w:rPr>
+        <w:rFonts w:hint="eastAsia"/>
+      </w:rPr>
+    </w:lvl>
+    <w:lvl w:ilvl="6">
+      <w:start w:val="1"/>
+      <w:numFmt w:val="decimalEnclosedCircle"/>
+      <w:lvlText w:val="%7"/>
+      <w:lvlJc w:val="left"/>
+      <w:pPr>
+        <w:ind w:left="397" w:hanging="397"/>
+      </w:pPr>
+      <w:rPr>
+        <w:rFonts w:hint="eastAsia"/>
+      </w:rPr>
+    </w:lvl>
+    <w:lvl w:ilvl="7">
+      <w:start w:val="1"/>
+      <w:numFmt w:val="decimal"/>
+      <w:lvlText w:val="%1.%2.%3.%4.%5.%6.%7.%8"/>
+      <w:lvlJc w:val="left"/>
+      <w:pPr>
+        <w:ind w:left="3400" w:hanging="425"/>
+      </w:pPr>
+      <w:rPr>
+        <w:rFonts w:hint="eastAsia"/>
+      </w:rPr>
+    </w:lvl>
+    <w:lvl w:ilvl="8">
+      <w:start w:val="1"/>
+      <w:numFmt w:val="decimal"/>
+      <w:lvlText w:val="%1.%2.%3.%4.%5.%6.%7.%8.%9"/>
+      <w:lvlJc w:val="left"/>
+      <w:pPr>
+        <w:ind w:left="3825" w:hanging="425"/>
+      </w:pPr>
+      <w:rPr>
+        <w:rFonts w:hint="eastAsia"/>
+      </w:rPr>
+    </w:lvl>
+  </w:abstractNum>
+  <w:abstractNum w:abstractNumId="4" w15:restartNumberingAfterBreak="0">
     <w:nsid w:val="6CA3008C"/>
     <w:multiLevelType w:val="multilevel"/>
     <w:tmpl w:val="3DFE8C84"/>
@@ -912,11 +1238,109 @@
       </w:rPr>
     </w:lvl>
   </w:abstractNum>
+  <w:abstractNum w:abstractNumId="5" w15:restartNumberingAfterBreak="0">
+    <w:nsid w:val="7119171A"/>
+    <w:multiLevelType w:val="multilevel"/>
+    <w:tmpl w:val="0409001D"/>
+    <w:lvl w:ilvl="0">
+      <w:start w:val="1"/>
+      <w:numFmt w:val="decimal"/>
+      <w:lvlText w:val="%1"/>
+      <w:lvlJc w:val="left"/>
+      <w:pPr>
+        <w:ind w:left="425" w:hanging="425"/>
+      </w:pPr>
+    </w:lvl>
+    <w:lvl w:ilvl="1">
+      <w:start w:val="1"/>
+      <w:numFmt w:val="decimal"/>
+      <w:lvlText w:val="%1.%2"/>
+      <w:lvlJc w:val="left"/>
+      <w:pPr>
+        <w:ind w:left="992" w:hanging="567"/>
+      </w:pPr>
+    </w:lvl>
+    <w:lvl w:ilvl="2">
+      <w:start w:val="1"/>
+      <w:numFmt w:val="decimal"/>
+      <w:lvlText w:val="%1.%2.%3"/>
+      <w:lvlJc w:val="left"/>
+      <w:pPr>
+        <w:ind w:left="1418" w:hanging="567"/>
+      </w:pPr>
+    </w:lvl>
+    <w:lvl w:ilvl="3">
+      <w:start w:val="1"/>
+      <w:numFmt w:val="decimal"/>
+      <w:lvlText w:val="%1.%2.%3.%4"/>
+      <w:lvlJc w:val="left"/>
+      <w:pPr>
+        <w:ind w:left="1984" w:hanging="708"/>
+      </w:pPr>
+    </w:lvl>
+    <w:lvl w:ilvl="4">
+      <w:start w:val="1"/>
+      <w:numFmt w:val="decimal"/>
+      <w:lvlText w:val="%1.%2.%3.%4.%5"/>
+      <w:lvlJc w:val="left"/>
+      <w:pPr>
+        <w:ind w:left="2551" w:hanging="850"/>
+      </w:pPr>
+    </w:lvl>
+    <w:lvl w:ilvl="5">
+      <w:start w:val="1"/>
+      <w:numFmt w:val="decimal"/>
+      <w:lvlText w:val="%1.%2.%3.%4.%5.%6"/>
+      <w:lvlJc w:val="left"/>
+      <w:pPr>
+        <w:ind w:left="3260" w:hanging="1134"/>
+      </w:pPr>
+    </w:lvl>
+    <w:lvl w:ilvl="6">
+      <w:start w:val="1"/>
+      <w:numFmt w:val="decimal"/>
+      <w:lvlText w:val="%1.%2.%3.%4.%5.%6.%7"/>
+      <w:lvlJc w:val="left"/>
+      <w:pPr>
+        <w:ind w:left="3827" w:hanging="1276"/>
+      </w:pPr>
+    </w:lvl>
+    <w:lvl w:ilvl="7">
+      <w:start w:val="1"/>
+      <w:numFmt w:val="decimal"/>
+      <w:lvlText w:val="%1.%2.%3.%4.%5.%6.%7.%8"/>
+      <w:lvlJc w:val="left"/>
+      <w:pPr>
+        <w:ind w:left="4394" w:hanging="1418"/>
+      </w:pPr>
+    </w:lvl>
+    <w:lvl w:ilvl="8">
+      <w:start w:val="1"/>
+      <w:numFmt w:val="decimal"/>
+      <w:lvlText w:val="%1.%2.%3.%4.%5.%6.%7.%8.%9"/>
+      <w:lvlJc w:val="left"/>
+      <w:pPr>
+        <w:ind w:left="5102" w:hanging="1700"/>
+      </w:pPr>
+    </w:lvl>
+  </w:abstractNum>
   <w:num w:numId="1" w16cid:durableId="1075275835">
-    <w:abstractNumId w:val="1"/>
+    <w:abstractNumId w:val="4"/>
   </w:num>
   <w:num w:numId="2" w16cid:durableId="1500190160">
     <w:abstractNumId w:val="0"/>
+  </w:num>
+  <w:num w:numId="3" w16cid:durableId="2012296040">
+    <w:abstractNumId w:val="5"/>
+  </w:num>
+  <w:num w:numId="4" w16cid:durableId="1822850565">
+    <w:abstractNumId w:val="1"/>
+  </w:num>
+  <w:num w:numId="5" w16cid:durableId="821313292">
+    <w:abstractNumId w:val="2"/>
+  </w:num>
+  <w:num w:numId="6" w16cid:durableId="705761220">
+    <w:abstractNumId w:val="3"/>
   </w:num>
 </w:numbering>
 </file>
@@ -1335,7 +1759,7 @@
     <w:link w:val="1Char"/>
     <w:uiPriority w:val="9"/>
     <w:qFormat/>
-    <w:rsid w:val="00776CC5"/>
+    <w:rsid w:val="00337EEA"/>
     <w:pPr>
       <w:numPr>
         <w:numId w:val="2"/>
@@ -1343,6 +1767,12 @@
       <w:jc w:val="center"/>
       <w:outlineLvl w:val="0"/>
     </w:pPr>
+    <w:rPr>
+      <w:b/>
+      <w:bCs/>
+      <w:sz w:val="28"/>
+      <w:szCs w:val="32"/>
+    </w:rPr>
   </w:style>
   <w:style w:type="paragraph" w:styleId="2">
     <w:name w:val="heading 2"/>
@@ -1443,15 +1873,17 @@
     <w:next w:val="a"/>
     <w:link w:val="7Char"/>
     <w:uiPriority w:val="9"/>
-    <w:semiHidden/>
     <w:unhideWhenUsed/>
     <w:qFormat/>
-    <w:rsid w:val="0005123F"/>
+    <w:rsid w:val="005D5237"/>
     <w:pPr>
       <w:keepNext/>
       <w:keepLines/>
+      <w:numPr>
+        <w:ilvl w:val="6"/>
+        <w:numId w:val="2"/>
+      </w:numPr>
       <w:spacing w:before="80" w:after="40"/>
-      <w:ind w:leftChars="300" w:left="300"/>
       <w:outlineLvl w:val="6"/>
     </w:pPr>
     <w:rPr>
@@ -1535,7 +1967,13 @@
     <w:basedOn w:val="a0"/>
     <w:link w:val="1"/>
     <w:uiPriority w:val="9"/>
-    <w:rsid w:val="00776CC5"/>
+    <w:rsid w:val="00337EEA"/>
+    <w:rPr>
+      <w:b/>
+      <w:bCs/>
+      <w:sz w:val="28"/>
+      <w:szCs w:val="32"/>
+    </w:rPr>
   </w:style>
   <w:style w:type="character" w:customStyle="1" w:styleId="2Char">
     <w:name w:val="제목 2 Char"/>
@@ -1581,8 +2019,7 @@
     <w:basedOn w:val="a0"/>
     <w:link w:val="7"/>
     <w:uiPriority w:val="9"/>
-    <w:semiHidden/>
-    <w:rsid w:val="0005123F"/>
+    <w:rsid w:val="005D5237"/>
     <w:rPr>
       <w:rFonts w:asciiTheme="majorHAnsi" w:eastAsiaTheme="majorEastAsia" w:hAnsiTheme="majorHAnsi" w:cstheme="majorBidi"/>
       <w:color w:val="000000" w:themeColor="text1"/>

</xml_diff>